<commit_message>
List author as independent researcher
The thesis is a self-study degree programme work, so no institutional
affiliation is claimed. ArXiv treats affiliation as optional, and COPE
guidance allows unaffiliated authors to publish as independent
researchers provided the accountability trail is explicit. Using
'Independent Researcher' rather than a blank field also keeps the arXiv
submission form, the manuscript, and future journal submission systems
consistent.
</commit_message>
<xml_diff>
--- a/paper/manuscript_zh.docx
+++ b/paper/manuscript_zh.docx
@@ -62,7 +62,7 @@
           <w:color w:val="282828"/>
           <w:lang w:eastAsia="zh-CN"/>
         </w:rPr>
-        <w:t>大众汽车</w:t>
+        <w:t>独立研究者</w:t>
       </w:r>
       <w:proofErr w:type="gramEnd"/>
       <w:r>
@@ -71,14 +71,12 @@
           <w:color w:val="282828"/>
           <w:lang w:eastAsia="zh-CN"/>
         </w:rPr>
-        <w:t>（中国</w:t>
       </w:r>
       <w:r>
         <w:rPr>
           <w:color w:val="282828"/>
           <w:lang w:eastAsia="zh-CN"/>
         </w:rPr>
-        <w:t>）</w:t>
       </w:r>
       <w:proofErr w:type="gramStart"/>
       <w:r>
@@ -87,21 +85,18 @@
           <w:color w:val="282828"/>
           <w:lang w:eastAsia="zh-CN"/>
         </w:rPr>
-        <w:t>投资有限公司</w:t>
       </w:r>
       <w:r>
         <w:rPr>
           <w:color w:val="282828"/>
           <w:lang w:eastAsia="zh-CN"/>
         </w:rPr>
-        <w:t xml:space="preserve">  </w:t>
       </w:r>
       <w:r>
         <w:rPr>
           <w:color w:val="282828"/>
           <w:lang w:eastAsia="zh-CN"/>
         </w:rPr>
-        <w:t>（</w:t>
       </w:r>
       <w:r>
         <w:rPr>
@@ -109,14 +104,12 @@
           <w:color w:val="282828"/>
           <w:lang w:eastAsia="zh-CN"/>
         </w:rPr>
-        <w:t>北京</w:t>
       </w:r>
       <w:r>
         <w:rPr>
           <w:color w:val="282828"/>
           <w:lang w:eastAsia="zh-CN"/>
         </w:rPr>
-        <w:t xml:space="preserve">  </w:t>
       </w:r>
       <w:r>
         <w:rPr>
@@ -124,7 +117,6 @@
           <w:color w:val="282828"/>
           <w:lang w:eastAsia="zh-CN"/>
         </w:rPr>
-        <w:t>100010</w:t>
       </w:r>
       <w:proofErr w:type="gramEnd"/>
       <w:r>
@@ -132,7 +124,6 @@
           <w:color w:val="282828"/>
           <w:lang w:eastAsia="zh-CN"/>
         </w:rPr>
-        <w:t>）</w:t>
       </w:r>
     </w:p>
     <w:p>

</xml_diff>